<commit_message>
Update journal-ready Word manuscript
</commit_message>
<xml_diff>
--- a/submission/Aurora_Flux_Aerospace_Systems_Manuscript.docx
+++ b/submission/Aurora_Flux_Aerospace_Systems_Manuscript.docx
@@ -19,7 +19,18 @@
         <w:t>Author:</w:t>
       </w:r>
       <w:r>
-        <w:t xml:space="preserve"> Mya P. Brown, independent researcher</w:t>
+        <w:t xml:space="preserve"> Mya P. Brown, independent researcher, Seattle, Washington, United States</w:t>
+      </w:r>
+    </w:p>
+    <w:p>
+      <w:r>
+        <w:rPr>
+          <w:b/>
+        </w:rPr>
+        <w:t>Corresponding author:</w:t>
+      </w:r>
+      <w:r>
+        <w:t xml:space="preserve"> mommommy1960@gmail.com</w:t>
       </w:r>
     </w:p>
     <w:p>
@@ -65,7 +76,7 @@
         <w:t>Keywords:</w:t>
       </w:r>
       <w:r>
-        <w:t xml:space="preserve"> propulsion measurement; momentum closure; uncertainty; falsification; reproducible software; spacecraft systems engineering; research assurance</w:t>
+        <w:t xml:space="preserve"> propulsion measurement; momentum closure; uncertainty; falsification; reproducible software; spacecraft systems engineering</w:t>
       </w:r>
     </w:p>
     <w:p>
@@ -627,19 +638,6 @@
         <w:pStyle w:val="Heading1"/>
       </w:pPr>
       <w:r>
-        <w:t>Ethics, safety, and competing interests</w:t>
-      </w:r>
-    </w:p>
-    <w:p>
-      <w:r>
-        <w:t>No human participants, animals, or operational propulsion hardware were used for this software manuscript. The repository prohibits direct connection to hazardous hardware without qualified engineering supervision, independent safety review, and a physical emergency disconnect. The author declares no competing financial interest. AI tools assisted with drafting and software development; all claims remain subject to author verification and journal disclosure requirements.</w:t>
-      </w:r>
-    </w:p>
-    <w:p>
-      <w:pPr>
-        <w:pStyle w:val="Heading1"/>
-      </w:pPr>
-      <w:r>
         <w:t>References</w:t>
       </w:r>
     </w:p>
@@ -709,6 +707,69 @@
       </w:r>
       <w:r>
         <w:t>, JCGM 100:2008. &lt;https://www.bipm.org/en/committees/jc/jcgm/publications&gt;</w:t>
+      </w:r>
+    </w:p>
+    <w:p>
+      <w:pPr>
+        <w:pStyle w:val="Heading1"/>
+      </w:pPr>
+      <w:r>
+        <w:t>Statements and Declarations</w:t>
+      </w:r>
+    </w:p>
+    <w:p>
+      <w:r>
+        <w:rPr>
+          <w:b/>
+        </w:rPr>
+        <w:t>Funding:</w:t>
+      </w:r>
+      <w:r>
+        <w:t xml:space="preserve"> The author declares that no funds, grants, or other support were received during the preparation of this manuscript.</w:t>
+      </w:r>
+    </w:p>
+    <w:p>
+      <w:r>
+        <w:rPr>
+          <w:b/>
+        </w:rPr>
+        <w:t>Competing interests:</w:t>
+      </w:r>
+      <w:r>
+        <w:t xml:space="preserve"> The author has no relevant financial or non-financial interests to disclose.</w:t>
+      </w:r>
+    </w:p>
+    <w:p>
+      <w:r>
+        <w:rPr>
+          <w:b/>
+        </w:rPr>
+        <w:t>Author contributions:</w:t>
+      </w:r>
+      <w:r>
+        <w:t xml:space="preserve"> Mya P. Brown performed the conceptualization, methodology, software development, validation, investigation, project administration, and writing. The author read and approved the final manuscript.</w:t>
+      </w:r>
+    </w:p>
+    <w:p>
+      <w:r>
+        <w:rPr>
+          <w:b/>
+        </w:rPr>
+        <w:t>Ethics and safety:</w:t>
+      </w:r>
+      <w:r>
+        <w:t xml:space="preserve"> No human participants, animals, or operational propulsion hardware were used for this software manuscript. The repository prohibits direct connection to hazardous hardware without qualified engineering supervision, independent safety review, and a physical emergency disconnect.</w:t>
+      </w:r>
+    </w:p>
+    <w:p>
+      <w:r>
+        <w:rPr>
+          <w:b/>
+        </w:rPr>
+        <w:t>Use of artificial intelligence:</w:t>
+      </w:r>
+      <w:r>
+        <w:t xml:space="preserve"> AI tools assisted with drafting and software development. Mya P. Brown reviewed the manuscript and accepts responsibility for its content and claims.</w:t>
       </w:r>
     </w:p>
     <w:sectPr>

</xml_diff>

<commit_message>
Synchronize frozen Word manuscript
</commit_message>
<xml_diff>
--- a/submission/Aurora_Flux_Aerospace_Systems_Manuscript.docx
+++ b/submission/Aurora_Flux_Aerospace_Systems_Manuscript.docx
@@ -630,7 +630,27 @@
     </w:p>
     <w:p>
       <w:r>
-        <w:t>Source, tests, schemas, example data, and audit materials are available at &lt;https://github.com/mommommy1960-lang/flux-drive-kernel&gt;. Exact release identifiers and archived DOI will be added before formal submission.</w:t>
+        <w:t xml:space="preserve">Source, tests, schemas, example data, and audit materials are available at &lt;https://github.com/mommommy1960-lang/flux-drive-kernel&gt;. The submission manuscript and supporting materials are frozen on branch </w:t>
+      </w:r>
+      <w:r>
+        <w:rPr>
+          <w:rFonts w:ascii="Courier New" w:hAnsi="Courier New"/>
+          <w:sz w:val="19"/>
+        </w:rPr>
+        <w:t>aurora-flux-formal-review</w:t>
+      </w:r>
+      <w:r>
+        <w:t xml:space="preserve"> at revision </w:t>
+      </w:r>
+      <w:r>
+        <w:rPr>
+          <w:rFonts w:ascii="Courier New" w:hAnsi="Courier New"/>
+          <w:sz w:val="19"/>
+        </w:rPr>
+        <w:t>e6dd7434ce125b99e4bd962741c486411aacf9b0</w:t>
+      </w:r>
+      <w:r>
+        <w:t>. No archived repository DOI has been assigned.</w:t>
       </w:r>
     </w:p>
     <w:p>

</xml_diff>